<commit_message>
Self-Assessment added, Updated Narratives, Included Course Outcomes
</commit_message>
<xml_diff>
--- a/Animal_Shelter_Dashboard/CS 499 - Narrative - Software and Engineering - MiMi.docx
+++ b/Animal_Shelter_Dashboard/CS 499 - Narrative - Software and Engineering - MiMi.docx
@@ -645,7 +645,7 @@
           <w:szCs w:val="24"/>
           <w:lang w:val="en-US"/>
         </w:rPr>
-        <w:t>language based</w:t>
+        <w:t>language-based</w:t>
       </w:r>
       <w:r>
         <w:rPr>
@@ -789,7 +789,37 @@
           <w:szCs w:val="24"/>
           <w:lang w:val="en-US"/>
         </w:rPr>
-        <w:t>I’ve also incorporated security middleware that prevents unauthorized modification of the database. A user must be logged in before being able to add, edit, and or delete database documents. This modification is implemented with JSON web tokens. Lastly, I wanted to integrate security by design. Besides the middleware, the database is built by the project to populate it with a defined schema. There is a script that loads the data adhering to the schema into the database. As a verified user makes changes to the collection, the forms have validators incorporated into the page. Lastly, I shifted to server sided pagination for get calls. However, this is explained more in the database section.</w:t>
+        <w:t xml:space="preserve">I’ve also incorporated security middleware that prevents unauthorized modification of the database. A user must be logged in before being able to add, edit, and or delete database documents. This modification is implemented with JSON web tokens. Lastly, I wanted to integrate security by design. Besides the middleware, the database is built by the project to populate it with a defined schema. There is a script that loads the data adhering to the schema into the database. As a verified user makes changes to the collection, the forms have validators incorporated into the page. Lastly, I shifted to server sided pagination </w:t>
+      </w:r>
+      <w:bookmarkStart w:name="_Int_3yxmIMy7" w:id="129215646"/>
+      <w:r>
+        <w:rPr>
+          <w:rFonts w:ascii="Times New Roman" w:hAnsi="Times New Roman" w:eastAsia="Times New Roman" w:cs="Times New Roman"/>
+          <w:b w:val="0"/>
+          <w:bCs w:val="0"/>
+          <w:i w:val="0"/>
+          <w:iCs w:val="0"/>
+          <w:noProof w:val="0"/>
+          <w:sz w:val="24"/>
+          <w:szCs w:val="24"/>
+          <w:lang w:val="en-US"/>
+        </w:rPr>
+        <w:t>for</w:t>
+      </w:r>
+      <w:bookmarkEnd w:id="129215646"/>
+      <w:r>
+        <w:rPr>
+          <w:rFonts w:ascii="Times New Roman" w:hAnsi="Times New Roman" w:eastAsia="Times New Roman" w:cs="Times New Roman"/>
+          <w:b w:val="0"/>
+          <w:bCs w:val="0"/>
+          <w:i w:val="0"/>
+          <w:iCs w:val="0"/>
+          <w:noProof w:val="0"/>
+          <w:sz w:val="24"/>
+          <w:szCs w:val="24"/>
+          <w:lang w:val="en-US"/>
+        </w:rPr>
+        <w:t xml:space="preserve"> get calls. However, this is explained more in the database section.</w:t>
       </w:r>
     </w:p>
     <w:p>
@@ -820,6 +850,7 @@
       <w:pPr>
         <w:pStyle w:val="Normal"/>
         <w:suppressLineNumbers w:val="0"/>
+        <w:bidi w:val="0"/>
         <w:spacing w:before="0" w:beforeAutospacing="off" w:after="160" w:afterAutospacing="off" w:line="480" w:lineRule="auto"/>
         <w:ind w:left="0" w:right="0" w:firstLine="720"/>
         <w:jc w:val="left"/>
@@ -948,7 +979,35 @@
           <w:szCs w:val="24"/>
           <w:lang w:val="en-US"/>
         </w:rPr>
-        <w:t>ome in the form of documentation. This documentation will require information about development</w:t>
+        <w:t xml:space="preserve">ome in the form of documentation. This documentation </w:t>
+      </w:r>
+      <w:r>
+        <w:rPr>
+          <w:rFonts w:ascii="Times New Roman" w:hAnsi="Times New Roman" w:eastAsia="Times New Roman" w:cs="Times New Roman"/>
+          <w:b w:val="0"/>
+          <w:bCs w:val="0"/>
+          <w:i w:val="0"/>
+          <w:iCs w:val="0"/>
+          <w:noProof w:val="0"/>
+          <w:sz w:val="24"/>
+          <w:szCs w:val="24"/>
+          <w:lang w:val="en-US"/>
+        </w:rPr>
+        <w:t>details</w:t>
+      </w:r>
+      <w:r>
+        <w:rPr>
+          <w:rFonts w:ascii="Times New Roman" w:hAnsi="Times New Roman" w:eastAsia="Times New Roman" w:cs="Times New Roman"/>
+          <w:b w:val="0"/>
+          <w:bCs w:val="0"/>
+          <w:i w:val="0"/>
+          <w:iCs w:val="0"/>
+          <w:noProof w:val="0"/>
+          <w:sz w:val="24"/>
+          <w:szCs w:val="24"/>
+          <w:lang w:val="en-US"/>
+        </w:rPr>
+        <w:t xml:space="preserve"> information about development</w:t>
       </w:r>
       <w:r>
         <w:rPr>
@@ -1103,146 +1162,6 @@
           <w:lang w:val="en-US"/>
         </w:rPr>
         <w:t xml:space="preserve"> </w:t>
-      </w:r>
-      <w:r>
-        <w:rPr>
-          <w:rFonts w:ascii="Times New Roman" w:hAnsi="Times New Roman" w:eastAsia="Times New Roman" w:cs="Times New Roman"/>
-          <w:b w:val="0"/>
-          <w:bCs w:val="0"/>
-          <w:i w:val="0"/>
-          <w:iCs w:val="0"/>
-          <w:noProof w:val="0"/>
-          <w:sz w:val="24"/>
-          <w:szCs w:val="24"/>
-          <w:lang w:val="en-US"/>
-        </w:rPr>
-        <w:t xml:space="preserve">I intend to meet outcome 4 by converting this application with a more flexible software stack to </w:t>
-      </w:r>
-      <w:r>
-        <w:rPr>
-          <w:rFonts w:ascii="Times New Roman" w:hAnsi="Times New Roman" w:eastAsia="Times New Roman" w:cs="Times New Roman"/>
-          <w:b w:val="0"/>
-          <w:bCs w:val="0"/>
-          <w:i w:val="0"/>
-          <w:iCs w:val="0"/>
-          <w:noProof w:val="0"/>
-          <w:sz w:val="24"/>
-          <w:szCs w:val="24"/>
-          <w:lang w:val="en-US"/>
-        </w:rPr>
-        <w:t>demonstrate</w:t>
-      </w:r>
-      <w:r>
-        <w:rPr>
-          <w:rFonts w:ascii="Times New Roman" w:hAnsi="Times New Roman" w:eastAsia="Times New Roman" w:cs="Times New Roman"/>
-          <w:b w:val="0"/>
-          <w:bCs w:val="0"/>
-          <w:i w:val="0"/>
-          <w:iCs w:val="0"/>
-          <w:noProof w:val="0"/>
-          <w:sz w:val="24"/>
-          <w:szCs w:val="24"/>
-          <w:lang w:val="en-US"/>
-        </w:rPr>
-        <w:t xml:space="preserve"> my skills, knowledge of industry tech</w:t>
-      </w:r>
-      <w:r>
-        <w:rPr>
-          <w:rFonts w:ascii="Times New Roman" w:hAnsi="Times New Roman" w:eastAsia="Times New Roman" w:cs="Times New Roman"/>
-          <w:b w:val="0"/>
-          <w:bCs w:val="0"/>
-          <w:i w:val="0"/>
-          <w:iCs w:val="0"/>
-          <w:noProof w:val="0"/>
-          <w:sz w:val="24"/>
-          <w:szCs w:val="24"/>
-          <w:lang w:val="en-US"/>
-        </w:rPr>
-        <w:t>niques,</w:t>
-      </w:r>
-      <w:r>
-        <w:rPr>
-          <w:rFonts w:ascii="Times New Roman" w:hAnsi="Times New Roman" w:eastAsia="Times New Roman" w:cs="Times New Roman"/>
-          <w:b w:val="0"/>
-          <w:bCs w:val="0"/>
-          <w:i w:val="0"/>
-          <w:iCs w:val="0"/>
-          <w:noProof w:val="0"/>
-          <w:sz w:val="24"/>
-          <w:szCs w:val="24"/>
-          <w:lang w:val="en-US"/>
-        </w:rPr>
-        <w:t xml:space="preserve"> and </w:t>
-      </w:r>
-      <w:r>
-        <w:rPr>
-          <w:rFonts w:ascii="Times New Roman" w:hAnsi="Times New Roman" w:eastAsia="Times New Roman" w:cs="Times New Roman"/>
-          <w:b w:val="0"/>
-          <w:bCs w:val="0"/>
-          <w:i w:val="0"/>
-          <w:iCs w:val="0"/>
-          <w:noProof w:val="0"/>
-          <w:sz w:val="24"/>
-          <w:szCs w:val="24"/>
-          <w:lang w:val="en-US"/>
-        </w:rPr>
-        <w:t>full stack</w:t>
-      </w:r>
-      <w:r>
-        <w:rPr>
-          <w:rFonts w:ascii="Times New Roman" w:hAnsi="Times New Roman" w:eastAsia="Times New Roman" w:cs="Times New Roman"/>
-          <w:b w:val="0"/>
-          <w:bCs w:val="0"/>
-          <w:i w:val="0"/>
-          <w:iCs w:val="0"/>
-          <w:noProof w:val="0"/>
-          <w:sz w:val="24"/>
-          <w:szCs w:val="24"/>
-          <w:lang w:val="en-US"/>
-        </w:rPr>
-        <w:t xml:space="preserve"> development techniques. </w:t>
-      </w:r>
-      <w:r>
-        <w:rPr>
-          <w:rFonts w:ascii="Times New Roman" w:hAnsi="Times New Roman" w:eastAsia="Times New Roman" w:cs="Times New Roman"/>
-          <w:b w:val="0"/>
-          <w:bCs w:val="0"/>
-          <w:i w:val="0"/>
-          <w:iCs w:val="0"/>
-          <w:noProof w:val="0"/>
-          <w:sz w:val="24"/>
-          <w:szCs w:val="24"/>
-          <w:lang w:val="en-US"/>
-        </w:rPr>
-        <w:t>Outcome 5 is met by implementing security protections for authentication and authorization of users.</w:t>
-      </w:r>
-      <w:r>
-        <w:rPr>
-          <w:rFonts w:ascii="Times New Roman" w:hAnsi="Times New Roman" w:eastAsia="Times New Roman" w:cs="Times New Roman"/>
-          <w:b w:val="0"/>
-          <w:bCs w:val="0"/>
-          <w:i w:val="0"/>
-          <w:iCs w:val="0"/>
-          <w:noProof w:val="0"/>
-          <w:sz w:val="24"/>
-          <w:szCs w:val="24"/>
-          <w:lang w:val="en-US"/>
-        </w:rPr>
-        <w:t xml:space="preserve"> Without the proper credentials and approval, the front-end is only capable of reading data. </w:t>
-      </w:r>
-      <w:r>
-        <w:rPr>
-          <w:rFonts w:ascii="Times New Roman" w:hAnsi="Times New Roman" w:eastAsia="Times New Roman" w:cs="Times New Roman"/>
-          <w:b w:val="0"/>
-          <w:bCs w:val="0"/>
-          <w:i w:val="0"/>
-          <w:iCs w:val="0"/>
-          <w:noProof w:val="0"/>
-          <w:sz w:val="24"/>
-          <w:szCs w:val="24"/>
-          <w:lang w:val="en-US"/>
-        </w:rPr>
-        <w:t xml:space="preserve">This request is handled with JSON web tokens. </w:t>
       </w:r>
     </w:p>
     <w:p>
@@ -1266,7 +1185,647 @@
           <w:szCs w:val="24"/>
           <w:lang w:val="en-US"/>
         </w:rPr>
-        <w:t xml:space="preserve">Changes to my coverage are with outcome 1. </w:t>
+        <w:t>Next, o</w:t>
+      </w:r>
+      <w:r>
+        <w:rPr>
+          <w:rFonts w:ascii="Times New Roman" w:hAnsi="Times New Roman" w:eastAsia="Times New Roman" w:cs="Times New Roman"/>
+          <w:b w:val="0"/>
+          <w:bCs w:val="0"/>
+          <w:i w:val="0"/>
+          <w:iCs w:val="0"/>
+          <w:noProof w:val="0"/>
+          <w:sz w:val="24"/>
+          <w:szCs w:val="24"/>
+          <w:lang w:val="en-US"/>
+        </w:rPr>
+        <w:t>utcome 4 is met</w:t>
+      </w:r>
+      <w:r>
+        <w:rPr>
+          <w:rFonts w:ascii="Times New Roman" w:hAnsi="Times New Roman" w:eastAsia="Times New Roman" w:cs="Times New Roman"/>
+          <w:b w:val="0"/>
+          <w:bCs w:val="0"/>
+          <w:i w:val="0"/>
+          <w:iCs w:val="0"/>
+          <w:noProof w:val="0"/>
+          <w:sz w:val="24"/>
+          <w:szCs w:val="24"/>
+          <w:lang w:val="en-US"/>
+        </w:rPr>
+        <w:t xml:space="preserve"> by converting this application with a more flexible software stack to </w:t>
+      </w:r>
+      <w:r>
+        <w:rPr>
+          <w:rFonts w:ascii="Times New Roman" w:hAnsi="Times New Roman" w:eastAsia="Times New Roman" w:cs="Times New Roman"/>
+          <w:b w:val="0"/>
+          <w:bCs w:val="0"/>
+          <w:i w:val="0"/>
+          <w:iCs w:val="0"/>
+          <w:noProof w:val="0"/>
+          <w:sz w:val="24"/>
+          <w:szCs w:val="24"/>
+          <w:lang w:val="en-US"/>
+        </w:rPr>
+        <w:t>demonstrate</w:t>
+      </w:r>
+      <w:r>
+        <w:rPr>
+          <w:rFonts w:ascii="Times New Roman" w:hAnsi="Times New Roman" w:eastAsia="Times New Roman" w:cs="Times New Roman"/>
+          <w:b w:val="0"/>
+          <w:bCs w:val="0"/>
+          <w:i w:val="0"/>
+          <w:iCs w:val="0"/>
+          <w:noProof w:val="0"/>
+          <w:sz w:val="24"/>
+          <w:szCs w:val="24"/>
+          <w:lang w:val="en-US"/>
+        </w:rPr>
+        <w:t xml:space="preserve"> my skills, knowledge of industry tech</w:t>
+      </w:r>
+      <w:r>
+        <w:rPr>
+          <w:rFonts w:ascii="Times New Roman" w:hAnsi="Times New Roman" w:eastAsia="Times New Roman" w:cs="Times New Roman"/>
+          <w:b w:val="0"/>
+          <w:bCs w:val="0"/>
+          <w:i w:val="0"/>
+          <w:iCs w:val="0"/>
+          <w:noProof w:val="0"/>
+          <w:sz w:val="24"/>
+          <w:szCs w:val="24"/>
+          <w:lang w:val="en-US"/>
+        </w:rPr>
+        <w:t>niques,</w:t>
+      </w:r>
+      <w:r>
+        <w:rPr>
+          <w:rFonts w:ascii="Times New Roman" w:hAnsi="Times New Roman" w:eastAsia="Times New Roman" w:cs="Times New Roman"/>
+          <w:b w:val="0"/>
+          <w:bCs w:val="0"/>
+          <w:i w:val="0"/>
+          <w:iCs w:val="0"/>
+          <w:noProof w:val="0"/>
+          <w:sz w:val="24"/>
+          <w:szCs w:val="24"/>
+          <w:lang w:val="en-US"/>
+        </w:rPr>
+        <w:t xml:space="preserve"> and </w:t>
+      </w:r>
+      <w:r>
+        <w:rPr>
+          <w:rFonts w:ascii="Times New Roman" w:hAnsi="Times New Roman" w:eastAsia="Times New Roman" w:cs="Times New Roman"/>
+          <w:b w:val="0"/>
+          <w:bCs w:val="0"/>
+          <w:i w:val="0"/>
+          <w:iCs w:val="0"/>
+          <w:noProof w:val="0"/>
+          <w:sz w:val="24"/>
+          <w:szCs w:val="24"/>
+          <w:lang w:val="en-US"/>
+        </w:rPr>
+        <w:t>full stack</w:t>
+      </w:r>
+      <w:r>
+        <w:rPr>
+          <w:rFonts w:ascii="Times New Roman" w:hAnsi="Times New Roman" w:eastAsia="Times New Roman" w:cs="Times New Roman"/>
+          <w:b w:val="0"/>
+          <w:bCs w:val="0"/>
+          <w:i w:val="0"/>
+          <w:iCs w:val="0"/>
+          <w:noProof w:val="0"/>
+          <w:sz w:val="24"/>
+          <w:szCs w:val="24"/>
+          <w:lang w:val="en-US"/>
+        </w:rPr>
+        <w:t xml:space="preserve"> development techniques</w:t>
+      </w:r>
+      <w:r>
+        <w:rPr>
+          <w:rFonts w:ascii="Times New Roman" w:hAnsi="Times New Roman" w:eastAsia="Times New Roman" w:cs="Times New Roman"/>
+          <w:b w:val="0"/>
+          <w:bCs w:val="0"/>
+          <w:i w:val="0"/>
+          <w:iCs w:val="0"/>
+          <w:noProof w:val="0"/>
+          <w:sz w:val="24"/>
+          <w:szCs w:val="24"/>
+          <w:lang w:val="en-US"/>
+        </w:rPr>
+        <w:t>.</w:t>
+      </w:r>
+      <w:r>
+        <w:rPr>
+          <w:rFonts w:ascii="Times New Roman" w:hAnsi="Times New Roman" w:eastAsia="Times New Roman" w:cs="Times New Roman"/>
+          <w:b w:val="0"/>
+          <w:bCs w:val="0"/>
+          <w:i w:val="0"/>
+          <w:iCs w:val="0"/>
+          <w:noProof w:val="0"/>
+          <w:sz w:val="24"/>
+          <w:szCs w:val="24"/>
+          <w:lang w:val="en-US"/>
+        </w:rPr>
+        <w:t xml:space="preserve"> There is a pipeline </w:t>
+      </w:r>
+      <w:r>
+        <w:rPr>
+          <w:rFonts w:ascii="Times New Roman" w:hAnsi="Times New Roman" w:eastAsia="Times New Roman" w:cs="Times New Roman"/>
+          <w:b w:val="0"/>
+          <w:bCs w:val="0"/>
+          <w:i w:val="0"/>
+          <w:iCs w:val="0"/>
+          <w:noProof w:val="0"/>
+          <w:sz w:val="24"/>
+          <w:szCs w:val="24"/>
+          <w:lang w:val="en-US"/>
+        </w:rPr>
+        <w:t>for</w:t>
+      </w:r>
+      <w:r>
+        <w:rPr>
+          <w:rFonts w:ascii="Times New Roman" w:hAnsi="Times New Roman" w:eastAsia="Times New Roman" w:cs="Times New Roman"/>
+          <w:b w:val="0"/>
+          <w:bCs w:val="0"/>
+          <w:i w:val="0"/>
+          <w:iCs w:val="0"/>
+          <w:noProof w:val="0"/>
+          <w:sz w:val="24"/>
+          <w:szCs w:val="24"/>
+          <w:lang w:val="en-US"/>
+        </w:rPr>
+        <w:t xml:space="preserve"> </w:t>
+      </w:r>
+      <w:r>
+        <w:rPr>
+          <w:rFonts w:ascii="Times New Roman" w:hAnsi="Times New Roman" w:eastAsia="Times New Roman" w:cs="Times New Roman"/>
+          <w:b w:val="0"/>
+          <w:bCs w:val="0"/>
+          <w:i w:val="0"/>
+          <w:iCs w:val="0"/>
+          <w:noProof w:val="0"/>
+          <w:sz w:val="24"/>
+          <w:szCs w:val="24"/>
+          <w:lang w:val="en-US"/>
+        </w:rPr>
+        <w:t>build</w:t>
+      </w:r>
+      <w:r>
+        <w:rPr>
+          <w:rFonts w:ascii="Times New Roman" w:hAnsi="Times New Roman" w:eastAsia="Times New Roman" w:cs="Times New Roman"/>
+          <w:b w:val="0"/>
+          <w:bCs w:val="0"/>
+          <w:i w:val="0"/>
+          <w:iCs w:val="0"/>
+          <w:noProof w:val="0"/>
+          <w:sz w:val="24"/>
+          <w:szCs w:val="24"/>
+          <w:lang w:val="en-US"/>
+        </w:rPr>
+        <w:t>ing</w:t>
+      </w:r>
+      <w:r>
+        <w:rPr>
+          <w:rFonts w:ascii="Times New Roman" w:hAnsi="Times New Roman" w:eastAsia="Times New Roman" w:cs="Times New Roman"/>
+          <w:b w:val="0"/>
+          <w:bCs w:val="0"/>
+          <w:i w:val="0"/>
+          <w:iCs w:val="0"/>
+          <w:noProof w:val="0"/>
+          <w:sz w:val="24"/>
+          <w:szCs w:val="24"/>
+          <w:lang w:val="en-US"/>
+        </w:rPr>
+        <w:t xml:space="preserve"> the application</w:t>
+      </w:r>
+      <w:r>
+        <w:rPr>
+          <w:rFonts w:ascii="Times New Roman" w:hAnsi="Times New Roman" w:eastAsia="Times New Roman" w:cs="Times New Roman"/>
+          <w:b w:val="0"/>
+          <w:bCs w:val="0"/>
+          <w:i w:val="0"/>
+          <w:iCs w:val="0"/>
+          <w:noProof w:val="0"/>
+          <w:sz w:val="24"/>
+          <w:szCs w:val="24"/>
+          <w:lang w:val="en-US"/>
+        </w:rPr>
+        <w:t xml:space="preserve">. Manage the data, build the backend, construct the API, make the </w:t>
+      </w:r>
+      <w:r>
+        <w:rPr>
+          <w:rFonts w:ascii="Times New Roman" w:hAnsi="Times New Roman" w:eastAsia="Times New Roman" w:cs="Times New Roman"/>
+          <w:b w:val="0"/>
+          <w:bCs w:val="0"/>
+          <w:i w:val="0"/>
+          <w:iCs w:val="0"/>
+          <w:noProof w:val="0"/>
+          <w:sz w:val="24"/>
+          <w:szCs w:val="24"/>
+          <w:lang w:val="en-US"/>
+        </w:rPr>
+        <w:t>fron</w:t>
+      </w:r>
+      <w:r>
+        <w:rPr>
+          <w:rFonts w:ascii="Times New Roman" w:hAnsi="Times New Roman" w:eastAsia="Times New Roman" w:cs="Times New Roman"/>
+          <w:b w:val="0"/>
+          <w:bCs w:val="0"/>
+          <w:i w:val="0"/>
+          <w:iCs w:val="0"/>
+          <w:noProof w:val="0"/>
+          <w:sz w:val="24"/>
+          <w:szCs w:val="24"/>
+          <w:lang w:val="en-US"/>
+        </w:rPr>
+        <w:t>t</w:t>
+      </w:r>
+      <w:r>
+        <w:rPr>
+          <w:rFonts w:ascii="Times New Roman" w:hAnsi="Times New Roman" w:eastAsia="Times New Roman" w:cs="Times New Roman"/>
+          <w:b w:val="0"/>
+          <w:bCs w:val="0"/>
+          <w:i w:val="0"/>
+          <w:iCs w:val="0"/>
+          <w:noProof w:val="0"/>
+          <w:sz w:val="24"/>
+          <w:szCs w:val="24"/>
+          <w:lang w:val="en-US"/>
+        </w:rPr>
+        <w:t>-end</w:t>
+      </w:r>
+      <w:r>
+        <w:rPr>
+          <w:rFonts w:ascii="Times New Roman" w:hAnsi="Times New Roman" w:eastAsia="Times New Roman" w:cs="Times New Roman"/>
+          <w:b w:val="0"/>
+          <w:bCs w:val="0"/>
+          <w:i w:val="0"/>
+          <w:iCs w:val="0"/>
+          <w:noProof w:val="0"/>
+          <w:sz w:val="24"/>
+          <w:szCs w:val="24"/>
+          <w:lang w:val="en-US"/>
+        </w:rPr>
+        <w:t xml:space="preserve">, then use the API </w:t>
+      </w:r>
+      <w:r>
+        <w:rPr>
+          <w:rFonts w:ascii="Times New Roman" w:hAnsi="Times New Roman" w:eastAsia="Times New Roman" w:cs="Times New Roman"/>
+          <w:b w:val="0"/>
+          <w:bCs w:val="0"/>
+          <w:i w:val="0"/>
+          <w:iCs w:val="0"/>
+          <w:noProof w:val="0"/>
+          <w:sz w:val="24"/>
+          <w:szCs w:val="24"/>
+          <w:lang w:val="en-US"/>
+        </w:rPr>
+        <w:t>to tie</w:t>
+      </w:r>
+      <w:r>
+        <w:rPr>
+          <w:rFonts w:ascii="Times New Roman" w:hAnsi="Times New Roman" w:eastAsia="Times New Roman" w:cs="Times New Roman"/>
+          <w:b w:val="0"/>
+          <w:bCs w:val="0"/>
+          <w:i w:val="0"/>
+          <w:iCs w:val="0"/>
+          <w:noProof w:val="0"/>
+          <w:sz w:val="24"/>
+          <w:szCs w:val="24"/>
+          <w:lang w:val="en-US"/>
+        </w:rPr>
+        <w:t xml:space="preserve"> the back-end functionality to the front-end. Each of these steps </w:t>
+      </w:r>
+      <w:r>
+        <w:rPr>
+          <w:rFonts w:ascii="Times New Roman" w:hAnsi="Times New Roman" w:eastAsia="Times New Roman" w:cs="Times New Roman"/>
+          <w:b w:val="0"/>
+          <w:bCs w:val="0"/>
+          <w:i w:val="0"/>
+          <w:iCs w:val="0"/>
+          <w:noProof w:val="0"/>
+          <w:sz w:val="24"/>
+          <w:szCs w:val="24"/>
+          <w:lang w:val="en-US"/>
+        </w:rPr>
+        <w:t>needs</w:t>
+      </w:r>
+      <w:r>
+        <w:rPr>
+          <w:rFonts w:ascii="Times New Roman" w:hAnsi="Times New Roman" w:eastAsia="Times New Roman" w:cs="Times New Roman"/>
+          <w:b w:val="0"/>
+          <w:bCs w:val="0"/>
+          <w:i w:val="0"/>
+          <w:iCs w:val="0"/>
+          <w:noProof w:val="0"/>
+          <w:sz w:val="24"/>
+          <w:szCs w:val="24"/>
+          <w:lang w:val="en-US"/>
+        </w:rPr>
+        <w:t xml:space="preserve"> some testing to ensure that they are </w:t>
+      </w:r>
+      <w:r>
+        <w:rPr>
+          <w:rFonts w:ascii="Times New Roman" w:hAnsi="Times New Roman" w:eastAsia="Times New Roman" w:cs="Times New Roman"/>
+          <w:b w:val="0"/>
+          <w:bCs w:val="0"/>
+          <w:i w:val="0"/>
+          <w:iCs w:val="0"/>
+          <w:noProof w:val="0"/>
+          <w:sz w:val="24"/>
+          <w:szCs w:val="24"/>
+          <w:lang w:val="en-US"/>
+        </w:rPr>
+        <w:t>operating</w:t>
+      </w:r>
+      <w:r>
+        <w:rPr>
+          <w:rFonts w:ascii="Times New Roman" w:hAnsi="Times New Roman" w:eastAsia="Times New Roman" w:cs="Times New Roman"/>
+          <w:b w:val="0"/>
+          <w:bCs w:val="0"/>
+          <w:i w:val="0"/>
+          <w:iCs w:val="0"/>
+          <w:noProof w:val="0"/>
+          <w:sz w:val="24"/>
+          <w:szCs w:val="24"/>
+          <w:lang w:val="en-US"/>
+        </w:rPr>
+        <w:t xml:space="preserve"> properly.</w:t>
+      </w:r>
+      <w:r>
+        <w:rPr>
+          <w:rFonts w:ascii="Times New Roman" w:hAnsi="Times New Roman" w:eastAsia="Times New Roman" w:cs="Times New Roman"/>
+          <w:b w:val="0"/>
+          <w:bCs w:val="0"/>
+          <w:i w:val="0"/>
+          <w:iCs w:val="0"/>
+          <w:noProof w:val="0"/>
+          <w:sz w:val="24"/>
+          <w:szCs w:val="24"/>
+          <w:lang w:val="en-US"/>
+        </w:rPr>
+        <w:t xml:space="preserve"> </w:t>
+      </w:r>
+      <w:r>
+        <w:rPr>
+          <w:rFonts w:ascii="Times New Roman" w:hAnsi="Times New Roman" w:eastAsia="Times New Roman" w:cs="Times New Roman"/>
+          <w:b w:val="0"/>
+          <w:bCs w:val="0"/>
+          <w:i w:val="0"/>
+          <w:iCs w:val="0"/>
+          <w:noProof w:val="0"/>
+          <w:sz w:val="24"/>
+          <w:szCs w:val="24"/>
+          <w:lang w:val="en-US"/>
+        </w:rPr>
+        <w:t>Continuing</w:t>
+      </w:r>
+      <w:r>
+        <w:rPr>
+          <w:rFonts w:ascii="Times New Roman" w:hAnsi="Times New Roman" w:eastAsia="Times New Roman" w:cs="Times New Roman"/>
+          <w:b w:val="0"/>
+          <w:bCs w:val="0"/>
+          <w:i w:val="0"/>
+          <w:iCs w:val="0"/>
+          <w:noProof w:val="0"/>
+          <w:sz w:val="24"/>
+          <w:szCs w:val="24"/>
+          <w:lang w:val="en-US"/>
+        </w:rPr>
+        <w:t>,</w:t>
+      </w:r>
+      <w:r>
+        <w:rPr>
+          <w:rFonts w:ascii="Times New Roman" w:hAnsi="Times New Roman" w:eastAsia="Times New Roman" w:cs="Times New Roman"/>
+          <w:b w:val="0"/>
+          <w:bCs w:val="0"/>
+          <w:i w:val="0"/>
+          <w:iCs w:val="0"/>
+          <w:noProof w:val="0"/>
+          <w:sz w:val="24"/>
+          <w:szCs w:val="24"/>
+          <w:lang w:val="en-US"/>
+        </w:rPr>
+        <w:t xml:space="preserve"> </w:t>
+      </w:r>
+      <w:r>
+        <w:rPr>
+          <w:rFonts w:ascii="Times New Roman" w:hAnsi="Times New Roman" w:eastAsia="Times New Roman" w:cs="Times New Roman"/>
+          <w:b w:val="0"/>
+          <w:bCs w:val="0"/>
+          <w:i w:val="0"/>
+          <w:iCs w:val="0"/>
+          <w:noProof w:val="0"/>
+          <w:sz w:val="24"/>
+          <w:szCs w:val="24"/>
+          <w:lang w:val="en-US"/>
+        </w:rPr>
+        <w:t>o</w:t>
+      </w:r>
+      <w:r>
+        <w:rPr>
+          <w:rFonts w:ascii="Times New Roman" w:hAnsi="Times New Roman" w:eastAsia="Times New Roman" w:cs="Times New Roman"/>
+          <w:b w:val="0"/>
+          <w:bCs w:val="0"/>
+          <w:i w:val="0"/>
+          <w:iCs w:val="0"/>
+          <w:noProof w:val="0"/>
+          <w:sz w:val="24"/>
+          <w:szCs w:val="24"/>
+          <w:lang w:val="en-US"/>
+        </w:rPr>
+        <w:t>utcome 5 is met by implementing security protections for authentication and authorization of users.</w:t>
+      </w:r>
+      <w:r>
+        <w:rPr>
+          <w:rFonts w:ascii="Times New Roman" w:hAnsi="Times New Roman" w:eastAsia="Times New Roman" w:cs="Times New Roman"/>
+          <w:b w:val="0"/>
+          <w:bCs w:val="0"/>
+          <w:i w:val="0"/>
+          <w:iCs w:val="0"/>
+          <w:noProof w:val="0"/>
+          <w:sz w:val="24"/>
+          <w:szCs w:val="24"/>
+          <w:lang w:val="en-US"/>
+        </w:rPr>
+        <w:t xml:space="preserve"> Without the proper credentials and approval, the front-end is only capable of reading data. </w:t>
+      </w:r>
+      <w:r>
+        <w:rPr>
+          <w:rFonts w:ascii="Times New Roman" w:hAnsi="Times New Roman" w:eastAsia="Times New Roman" w:cs="Times New Roman"/>
+          <w:b w:val="0"/>
+          <w:bCs w:val="0"/>
+          <w:i w:val="0"/>
+          <w:iCs w:val="0"/>
+          <w:noProof w:val="0"/>
+          <w:sz w:val="24"/>
+          <w:szCs w:val="24"/>
+          <w:lang w:val="en-US"/>
+        </w:rPr>
+        <w:t xml:space="preserve">This request is handled with JSON web tokens. </w:t>
+      </w:r>
+      <w:r>
+        <w:rPr>
+          <w:rFonts w:ascii="Times New Roman" w:hAnsi="Times New Roman" w:eastAsia="Times New Roman" w:cs="Times New Roman"/>
+          <w:b w:val="0"/>
+          <w:bCs w:val="0"/>
+          <w:i w:val="0"/>
+          <w:iCs w:val="0"/>
+          <w:noProof w:val="0"/>
+          <w:sz w:val="24"/>
+          <w:szCs w:val="24"/>
+          <w:lang w:val="en-US"/>
+        </w:rPr>
+        <w:t xml:space="preserve">Another aspect of security implemented is how data integrity is </w:t>
+      </w:r>
+      <w:r>
+        <w:rPr>
+          <w:rFonts w:ascii="Times New Roman" w:hAnsi="Times New Roman" w:eastAsia="Times New Roman" w:cs="Times New Roman"/>
+          <w:b w:val="0"/>
+          <w:bCs w:val="0"/>
+          <w:i w:val="0"/>
+          <w:iCs w:val="0"/>
+          <w:noProof w:val="0"/>
+          <w:sz w:val="24"/>
+          <w:szCs w:val="24"/>
+          <w:lang w:val="en-US"/>
+        </w:rPr>
+        <w:t>maintained</w:t>
+      </w:r>
+      <w:r>
+        <w:rPr>
+          <w:rFonts w:ascii="Times New Roman" w:hAnsi="Times New Roman" w:eastAsia="Times New Roman" w:cs="Times New Roman"/>
+          <w:b w:val="0"/>
+          <w:bCs w:val="0"/>
+          <w:i w:val="0"/>
+          <w:iCs w:val="0"/>
+          <w:noProof w:val="0"/>
+          <w:sz w:val="24"/>
+          <w:szCs w:val="24"/>
+          <w:lang w:val="en-US"/>
+        </w:rPr>
+        <w:t xml:space="preserve"> by the application. The app builds the database collection with a script which relies on defined schemas. </w:t>
+      </w:r>
+      <w:r>
+        <w:rPr>
+          <w:rFonts w:ascii="Times New Roman" w:hAnsi="Times New Roman" w:eastAsia="Times New Roman" w:cs="Times New Roman"/>
+          <w:b w:val="0"/>
+          <w:bCs w:val="0"/>
+          <w:i w:val="0"/>
+          <w:iCs w:val="0"/>
+          <w:noProof w:val="0"/>
+          <w:sz w:val="24"/>
+          <w:szCs w:val="24"/>
+          <w:lang w:val="en-US"/>
+        </w:rPr>
+        <w:t>As data is inputted through a user in the front-</w:t>
+      </w:r>
+      <w:r>
+        <w:rPr>
+          <w:rFonts w:ascii="Times New Roman" w:hAnsi="Times New Roman" w:eastAsia="Times New Roman" w:cs="Times New Roman"/>
+          <w:b w:val="0"/>
+          <w:bCs w:val="0"/>
+          <w:i w:val="0"/>
+          <w:iCs w:val="0"/>
+          <w:noProof w:val="0"/>
+          <w:sz w:val="24"/>
+          <w:szCs w:val="24"/>
+          <w:lang w:val="en-US"/>
+        </w:rPr>
+        <w:t>end</w:t>
+      </w:r>
+      <w:r>
+        <w:rPr>
+          <w:rFonts w:ascii="Times New Roman" w:hAnsi="Times New Roman" w:eastAsia="Times New Roman" w:cs="Times New Roman"/>
+          <w:b w:val="0"/>
+          <w:bCs w:val="0"/>
+          <w:i w:val="0"/>
+          <w:iCs w:val="0"/>
+          <w:noProof w:val="0"/>
+          <w:sz w:val="24"/>
+          <w:szCs w:val="24"/>
+          <w:lang w:val="en-US"/>
+        </w:rPr>
+        <w:t xml:space="preserve"> there are validators present to prevent “bad” data from going through.</w:t>
+      </w:r>
+    </w:p>
+    <w:p>
+      <w:pPr>
+        <w:pStyle w:val="Normal"/>
+        <w:suppressLineNumbers w:val="0"/>
+        <w:bidi w:val="0"/>
+        <w:spacing w:before="0" w:beforeAutospacing="off" w:after="160" w:afterAutospacing="off" w:line="480" w:lineRule="auto"/>
+        <w:ind w:left="0" w:right="0" w:firstLine="720"/>
+        <w:jc w:val="left"/>
+      </w:pPr>
+      <w:r>
+        <w:rPr>
+          <w:rFonts w:ascii="Times New Roman" w:hAnsi="Times New Roman" w:eastAsia="Times New Roman" w:cs="Times New Roman"/>
+          <w:b w:val="0"/>
+          <w:bCs w:val="0"/>
+          <w:i w:val="0"/>
+          <w:iCs w:val="0"/>
+          <w:noProof w:val="0"/>
+          <w:sz w:val="24"/>
+          <w:szCs w:val="24"/>
+          <w:lang w:val="en-US"/>
+        </w:rPr>
+        <w:t xml:space="preserve">This project </w:t>
+      </w:r>
+      <w:r>
+        <w:rPr>
+          <w:rFonts w:ascii="Times New Roman" w:hAnsi="Times New Roman" w:eastAsia="Times New Roman" w:cs="Times New Roman"/>
+          <w:b w:val="0"/>
+          <w:bCs w:val="0"/>
+          <w:i w:val="0"/>
+          <w:iCs w:val="0"/>
+          <w:noProof w:val="0"/>
+          <w:sz w:val="24"/>
+          <w:szCs w:val="24"/>
+          <w:lang w:val="en-US"/>
+        </w:rPr>
+        <w:t>somewhat covers</w:t>
+      </w:r>
+      <w:r>
+        <w:rPr>
+          <w:rFonts w:ascii="Times New Roman" w:hAnsi="Times New Roman" w:eastAsia="Times New Roman" w:cs="Times New Roman"/>
+          <w:b w:val="0"/>
+          <w:bCs w:val="0"/>
+          <w:i w:val="0"/>
+          <w:iCs w:val="0"/>
+          <w:noProof w:val="0"/>
+          <w:sz w:val="24"/>
+          <w:szCs w:val="24"/>
+          <w:lang w:val="en-US"/>
+        </w:rPr>
+        <w:t xml:space="preserve"> </w:t>
+      </w:r>
+      <w:r>
+        <w:rPr>
+          <w:rFonts w:ascii="Times New Roman" w:hAnsi="Times New Roman" w:eastAsia="Times New Roman" w:cs="Times New Roman"/>
+          <w:b w:val="0"/>
+          <w:bCs w:val="0"/>
+          <w:i w:val="0"/>
+          <w:iCs w:val="0"/>
+          <w:noProof w:val="0"/>
+          <w:sz w:val="24"/>
+          <w:szCs w:val="24"/>
+          <w:lang w:val="en-US"/>
+        </w:rPr>
+        <w:t xml:space="preserve">outcome </w:t>
+      </w:r>
+      <w:r>
+        <w:rPr>
+          <w:rFonts w:ascii="Times New Roman" w:hAnsi="Times New Roman" w:eastAsia="Times New Roman" w:cs="Times New Roman"/>
+          <w:b w:val="0"/>
+          <w:bCs w:val="0"/>
+          <w:i w:val="0"/>
+          <w:iCs w:val="0"/>
+          <w:noProof w:val="0"/>
+          <w:sz w:val="24"/>
+          <w:szCs w:val="24"/>
+          <w:lang w:val="en-US"/>
+        </w:rPr>
+        <w:t xml:space="preserve">1. </w:t>
       </w:r>
       <w:r>
         <w:rPr>
@@ -1350,7 +1909,35 @@
           <w:szCs w:val="24"/>
           <w:lang w:val="en-US"/>
         </w:rPr>
-        <w:t xml:space="preserve"> improved the quality of code with comments and modularity for enhanced readability. I take the critcisms from my instructor and code-review to heart and </w:t>
+        <w:t xml:space="preserve"> improved the quality of code with comments and modularity for enhanced readability. I take the </w:t>
+      </w:r>
+      <w:r>
+        <w:rPr>
+          <w:rFonts w:ascii="Times New Roman" w:hAnsi="Times New Roman" w:eastAsia="Times New Roman" w:cs="Times New Roman"/>
+          <w:b w:val="0"/>
+          <w:bCs w:val="0"/>
+          <w:i w:val="0"/>
+          <w:iCs w:val="0"/>
+          <w:noProof w:val="0"/>
+          <w:sz w:val="24"/>
+          <w:szCs w:val="24"/>
+          <w:lang w:val="en-US"/>
+        </w:rPr>
+        <w:t>criticisms</w:t>
+      </w:r>
+      <w:r>
+        <w:rPr>
+          <w:rFonts w:ascii="Times New Roman" w:hAnsi="Times New Roman" w:eastAsia="Times New Roman" w:cs="Times New Roman"/>
+          <w:b w:val="0"/>
+          <w:bCs w:val="0"/>
+          <w:i w:val="0"/>
+          <w:iCs w:val="0"/>
+          <w:noProof w:val="0"/>
+          <w:sz w:val="24"/>
+          <w:szCs w:val="24"/>
+          <w:lang w:val="en-US"/>
+        </w:rPr>
+        <w:t xml:space="preserve"> from my instructor and code-review to heart and </w:t>
       </w:r>
       <w:r>
         <w:rPr>
@@ -2122,6 +2709,9 @@
     <int2:textHash int2:hashCode="o/0Kcx28Ig6SU1" int2:id="J6b6YlsD">
       <int2:state int2:type="spell" int2:value="Rejected"/>
     </int2:textHash>
+    <int2:bookmark int2:bookmarkName="_Int_3yxmIMy7" int2:invalidationBookmarkName="" int2:hashCode="Q+75piq7ix4WVP" int2:id="nOf1m5XI">
+      <int2:state int2:type="gram" int2:value="Rejected"/>
+    </int2:bookmark>
     <int2:bookmark int2:bookmarkName="_Int_1KRBFGXd" int2:invalidationBookmarkName="" int2:hashCode="X1VV9E+0Iv/Da/" int2:id="A5TMPtJF">
       <int2:state int2:type="gram" int2:value="Rejected"/>
     </int2:bookmark>
@@ -2132,12 +2722,6 @@
       <int2:state int2:type="gram" int2:value="Rejected"/>
     </int2:bookmark>
     <int2:bookmark int2:bookmarkName="_Int_yE1GFope" int2:invalidationBookmarkName="" int2:hashCode="CkWtnBQnbhvH2H" int2:id="OacMDhoa">
-      <int2:state int2:type="gram" int2:value="Rejected"/>
-    </int2:bookmark>
-    <int2:bookmark int2:bookmarkName="_Int_3LN46LIu" int2:invalidationBookmarkName="" int2:hashCode="tH82PitDDAZH8U" int2:id="etL08FZ1">
-      <int2:state int2:type="gram" int2:value="Rejected"/>
-    </int2:bookmark>
-    <int2:bookmark int2:bookmarkName="_Int_uZaRKe4r" int2:invalidationBookmarkName="" int2:hashCode="yHETp4UFHQWbAG" int2:id="c6vZ8e8y">
       <int2:state int2:type="gram" int2:value="Rejected"/>
     </int2:bookmark>
   </int2:observations>

</xml_diff>